<commit_message>
Runbook 04 executed: operator decided or ratified all 23 open questions (15 decided, 7 ratified, 1 deferred), register v2, CTO sign-off pack, decision record as evidence, repo-private recorded, stale public-repo text corrected
Co-Authored-By: Claude Sonnet 5.5 <noreply@anthropic.com>
Claude-Session: https://claude.ai/code/session_0151qWWqXudLjd499hP5H6NW
</commit_message>
<xml_diff>
--- a/runbook/04-OPEN-QUESTIONS-FINAL-REVISION.docx
+++ b/runbook/04-OPEN-QUESTIONS-FINAL-REVISION.docx
@@ -2,13 +2,13 @@
 <file path=word/document.xml><?xml version="1.0" encoding="utf-8"?>
 <w:document xmlns:w="http://schemas.openxmlformats.org/wordprocessingml/2006/main" xmlns:m="http://schemas.openxmlformats.org/officeDocument/2006/math" xmlns:r="http://schemas.openxmlformats.org/officeDocument/2006/relationships" xmlns:o="urn:schemas-microsoft-com:office:office" xmlns:v="urn:schemas-microsoft-com:vml" xmlns:w10="urn:schemas-microsoft-com:office:word" xmlns:a="http://schemas.openxmlformats.org/drawingml/2006/main" xmlns:pic="http://schemas.openxmlformats.org/drawingml/2006/picture" xmlns:wp="http://schemas.openxmlformats.org/drawingml/2006/wordprocessingDrawing">
   <w:body>
-    <w:bookmarkStart w:id="20" w:name="open-questions-final-revision-at-step-r5"/>
+    <w:bookmarkStart w:id="20" w:name="X90f4d47c15435f4c776840eb9db0fb970de07e2"/>
     <w:p>
       <w:pPr>
         <w:pStyle w:val="Heading1"/>
       </w:pPr>
       <w:r>
-        <w:t xml:space="preserve">Open questions: final revision at Step R5</w:t>
+        <w:t xml:space="preserve">Open questions: final revision (decisions recorded 2026-10-08)</w:t>
       </w:r>
     </w:p>
     <w:tbl>
@@ -72,33 +72,7 @@
               <w:jc w:val="left"/>
             </w:pPr>
             <w:r>
-              <w:t xml:space="preserve">R</w:t>
-            </w:r>
-          </w:p>
-        </w:tc>
-      </w:tr>
-      <w:tr>
-        <w:tc>
-          <w:tcPr/>
-          <w:p>
-            <w:pPr>
-              <w:pStyle w:val="Compact"/>
-              <w:jc w:val="left"/>
-            </w:pPr>
-            <w:r>
-              <w:t xml:space="preserve">Runbook step</w:t>
-            </w:r>
-          </w:p>
-        </w:tc>
-        <w:tc>
-          <w:tcPr/>
-          <w:p>
-            <w:pPr>
-              <w:pStyle w:val="Compact"/>
-              <w:jc w:val="left"/>
-            </w:pPr>
-            <w:r>
-              <w:t xml:space="preserve">R5 (runbook/02-TRANSFORMATION-RUNBOOK.md)</w:t>
+              <w:t xml:space="preserve">T (Runbook 04 execution; supersedes the Stage R5 revision)</w:t>
             </w:r>
           </w:p>
         </w:tc>
@@ -124,7 +98,7 @@
               <w:jc w:val="left"/>
             </w:pPr>
             <w:r>
-              <w:t xml:space="preserve">v1.0</w:t>
+              <w:t xml:space="preserve">v2.0</w:t>
             </w:r>
           </w:p>
         </w:tc>
@@ -176,7 +150,7 @@
               <w:jc w:val="left"/>
             </w:pPr>
             <w:r>
-              <w:t xml:space="preserve">Claude Code agent (claude-sonnet-5-5), operator Dinesh</w:t>
+              <w:t xml:space="preserve">Claude Code agent (claude-sonnet-5-5); decisions by the operator, Dinesh</w:t>
             </w:r>
           </w:p>
         </w:tc>
@@ -202,7 +176,7 @@
               <w:jc w:val="left"/>
             </w:pPr>
             <w:r>
-              <w:t xml:space="preserve">Draft, PROVISIONAL approval (OQ-05)</w:t>
+              <w:t xml:space="preserve">All 23 questions decided, ratified or deferred by the operator; not independently confirmed</w:t>
             </w:r>
           </w:p>
         </w:tc>
@@ -228,33 +202,7 @@
               <w:jc w:val="left"/>
             </w:pPr>
             <w:r>
-              <w:t xml:space="preserve">runbook/04-OPEN-QUESTIONS-REGISTER.md; docs/00-preflight/operating-contract/open-governance-decisions.md</w:t>
-            </w:r>
-          </w:p>
-        </w:tc>
-      </w:tr>
-      <w:tr>
-        <w:tc>
-          <w:tcPr/>
-          <w:p>
-            <w:pPr>
-              <w:pStyle w:val="Compact"/>
-              <w:jc w:val="left"/>
-            </w:pPr>
-            <w:r>
-              <w:t xml:space="preserve">Assumptions</w:t>
-            </w:r>
-          </w:p>
-        </w:tc>
-        <w:tc>
-          <w:tcPr/>
-          <w:p>
-            <w:pPr>
-              <w:pStyle w:val="Compact"/>
-              <w:jc w:val="left"/>
-            </w:pPr>
-            <w:r>
-              <w:t xml:space="preserve">See assumptions in body</w:t>
+              <w:t xml:space="preserve">evidence/44-decisions/EVD-T-01-operator-decision-record.json; docs/44-decisions/open-questions-register-v2.md</w:t>
             </w:r>
           </w:p>
         </w:tc>
@@ -280,7 +228,7 @@
               <w:jc w:val="left"/>
             </w:pPr>
             <w:r>
-              <w:t xml:space="preserve">See open questions</w:t>
+              <w:t xml:space="preserve">OQ-07 deferred; OQ-15 intent unknown; engagement deadline unknown; independent review absent (GOV-10)</w:t>
             </w:r>
           </w:p>
         </w:tc>
@@ -306,84 +254,12 @@
               <w:jc w:val="left"/>
             </w:pPr>
             <w:r>
-              <w:t xml:space="preserve">Self-approved gate until named approvers exist</w:t>
+              <w:t xml:space="preserve">One person holds every role</w:t>
             </w:r>
           </w:p>
         </w:tc>
       </w:tr>
     </w:tbl>
-    <w:p>
-      <w:pPr>
-        <w:pStyle w:val="BodyText"/>
-      </w:pPr>
-      <w:r>
-        <w:t xml:space="preserve">Classification:</w:t>
-      </w:r>
-      <w:r>
-        <w:t xml:space="preserve"> </w:t>
-      </w:r>
-      <w:r>
-        <w:rPr>
-          <w:bCs/>
-          <w:b/>
-        </w:rPr>
-        <w:t xml:space="preserve">[VF]</w:t>
-      </w:r>
-      <w:r>
-        <w:t xml:space="preserve"> </w:t>
-      </w:r>
-      <w:r>
-        <w:t xml:space="preserve">Verified Fact,</w:t>
-      </w:r>
-      <w:r>
-        <w:t xml:space="preserve"> </w:t>
-      </w:r>
-      <w:r>
-        <w:rPr>
-          <w:bCs/>
-          <w:b/>
-        </w:rPr>
-        <w:t xml:space="preserve">[INF]</w:t>
-      </w:r>
-      <w:r>
-        <w:t xml:space="preserve"> </w:t>
-      </w:r>
-      <w:r>
-        <w:t xml:space="preserve">Inference,</w:t>
-      </w:r>
-      <w:r>
-        <w:t xml:space="preserve"> </w:t>
-      </w:r>
-      <w:r>
-        <w:rPr>
-          <w:bCs/>
-          <w:b/>
-        </w:rPr>
-        <w:t xml:space="preserve">[ASM]</w:t>
-      </w:r>
-      <w:r>
-        <w:t xml:space="preserve"> </w:t>
-      </w:r>
-      <w:r>
-        <w:t xml:space="preserve">Assumption,</w:t>
-      </w:r>
-      <w:r>
-        <w:t xml:space="preserve"> </w:t>
-      </w:r>
-      <w:r>
-        <w:rPr>
-          <w:bCs/>
-          <w:b/>
-        </w:rPr>
-        <w:t xml:space="preserve">[UNK]</w:t>
-      </w:r>
-      <w:r>
-        <w:t xml:space="preserve"> </w:t>
-      </w:r>
-      <w:r>
-        <w:t xml:space="preserve">Unknown.</w:t>
-      </w:r>
-    </w:p>
     <w:p>
       <w:pPr>
         <w:pStyle w:val="BodyText"/>
@@ -401,7 +277,7 @@
         <w:t xml:space="preserve">04-OPEN-QUESTIONS-REGISTER.md</w:t>
       </w:r>
       <w:r>
-        <w:t xml:space="preserve">. R-X9 asks for each to be resolved or</w:t>
+        <w:t xml:space="preserve">. The register’s rule: a question is closed when an owner records a decision with a date. The operator recorded all of them on 2026-10-08 under the provisional authority decided in OQ-05. Counts: 15 decided, 7 ratified, 1 deferred, 0 open.</w:t>
       </w:r>
       <w:r>
         <w:t xml:space="preserve"> </w:t>
@@ -411,28 +287,7 @@
           <w:bCs/>
           <w:b/>
         </w:rPr>
-        <w:t xml:space="preserve">formally accepted by an owner</w:t>
-      </w:r>
-      <w:r>
-        <w:t xml:space="preserve">. Only RESOLVED rows are closed;</w:t>
-      </w:r>
-      <w:r>
-        <w:t xml:space="preserve"> </w:t>
-      </w:r>
-      <w:r>
-        <w:t xml:space="preserve">“</w:t>
-      </w:r>
-      <w:r>
-        <w:t xml:space="preserve">RESOLVED (provisional)</w:t>
-      </w:r>
-      <w:r>
-        <w:t xml:space="preserve">”</w:t>
-      </w:r>
-      <w:r>
-        <w:t xml:space="preserve"> </w:t>
-      </w:r>
-      <w:r>
-        <w:t xml:space="preserve">means the engagement chose an answer that its owner has not confirmed. No question is formally accepted by a named person.</w:t>
+        <w:t xml:space="preserve">R-X9 is met on that rule, and the limit is stated: nothing is confirmed by anyone independent.</w:t>
       </w:r>
     </w:p>
     <w:tbl>
@@ -485,31 +340,31 @@
               <w:jc w:val="left"/>
             </w:pPr>
             <w:r>
-              <w:t xml:space="preserve">Final status</w:t>
-            </w:r>
-          </w:p>
-        </w:tc>
-        <w:tc>
-          <w:tcPr/>
-          <w:p>
-            <w:pPr>
-              <w:pStyle w:val="Compact"/>
-              <w:jc w:val="left"/>
-            </w:pPr>
-            <w:r>
-              <w:t xml:space="preserve">Basis</w:t>
-            </w:r>
-          </w:p>
-        </w:tc>
-        <w:tc>
-          <w:tcPr/>
-          <w:p>
-            <w:pPr>
-              <w:pStyle w:val="Compact"/>
-              <w:jc w:val="left"/>
-            </w:pPr>
-            <w:r>
-              <w:t xml:space="preserve">Owner role</w:t>
+              <w:t xml:space="preserve">Status</w:t>
+            </w:r>
+          </w:p>
+        </w:tc>
+        <w:tc>
+          <w:tcPr/>
+          <w:p>
+            <w:pPr>
+              <w:pStyle w:val="Compact"/>
+              <w:jc w:val="left"/>
+            </w:pPr>
+            <w:r>
+              <w:t xml:space="preserve">Decision</w:t>
+            </w:r>
+          </w:p>
+        </w:tc>
+        <w:tc>
+          <w:tcPr/>
+          <w:p>
+            <w:pPr>
+              <w:pStyle w:val="Compact"/>
+              <w:jc w:val="left"/>
+            </w:pPr>
+            <w:r>
+              <w:t xml:space="preserve">Source</w:t>
             </w:r>
           </w:p>
         </w:tc>
@@ -547,31 +402,31 @@
               <w:jc w:val="left"/>
             </w:pPr>
             <w:r>
-              <w:t xml:space="preserve">OPEN</w:t>
-            </w:r>
-          </w:p>
-        </w:tc>
-        <w:tc>
-          <w:tcPr/>
-          <w:p>
-            <w:pPr>
-              <w:pStyle w:val="Compact"/>
-              <w:jc w:val="left"/>
-            </w:pPr>
-            <w:r>
-              <w:t xml:space="preserve">default: platform-neutral container (ADR-0009); nobody accepted</w:t>
-            </w:r>
-          </w:p>
-        </w:tc>
-        <w:tc>
-          <w:tcPr/>
-          <w:p>
-            <w:pPr>
-              <w:pStyle w:val="Compact"/>
-              <w:jc w:val="left"/>
-            </w:pPr>
-            <w:r>
-              <w:t xml:space="preserve">Architecture (UNRESOLVED)</w:t>
+              <w:t xml:space="preserve">DECIDED</w:t>
+            </w:r>
+          </w:p>
+        </w:tc>
+        <w:tc>
+          <w:tcPr/>
+          <w:p>
+            <w:pPr>
+              <w:pStyle w:val="Compact"/>
+              <w:jc w:val="left"/>
+            </w:pPr>
+            <w:r>
+              <w:t xml:space="preserve">Stay platform-neutral. No cloud or runtime is named.</w:t>
+            </w:r>
+          </w:p>
+        </w:tc>
+        <w:tc>
+          <w:tcPr/>
+          <w:p>
+            <w:pPr>
+              <w:pStyle w:val="Compact"/>
+              <w:jc w:val="left"/>
+            </w:pPr>
+            <w:r>
+              <w:t xml:space="preserve">Round A, answer 2</w:t>
             </w:r>
           </w:p>
         </w:tc>
@@ -609,31 +464,31 @@
               <w:jc w:val="left"/>
             </w:pPr>
             <w:r>
-              <w:t xml:space="preserve">OPEN</w:t>
-            </w:r>
-          </w:p>
-        </w:tc>
-        <w:tc>
-          <w:tcPr/>
-          <w:p>
-            <w:pPr>
-              <w:pStyle w:val="Compact"/>
-              <w:jc w:val="left"/>
-            </w:pPr>
-            <w:r>
-              <w:t xml:space="preserve">no real model; Stage Q not performed</w:t>
-            </w:r>
-          </w:p>
-        </w:tc>
-        <w:tc>
-          <w:tcPr/>
-          <w:p>
-            <w:pPr>
-              <w:pStyle w:val="Compact"/>
-              <w:jc w:val="left"/>
-            </w:pPr>
-            <w:r>
-              <w:t xml:space="preserve">AI governance (UNRESOLVED)</w:t>
+              <w:t xml:space="preserve">DECIDED</w:t>
+            </w:r>
+          </w:p>
+        </w:tc>
+        <w:tc>
+          <w:tcPr/>
+          <w:p>
+            <w:pPr>
+              <w:pStyle w:val="Compact"/>
+              <w:jc w:val="left"/>
+            </w:pPr>
+            <w:r>
+              <w:t xml:space="preserve">No model is used. The deterministic provider stays the only provider.</w:t>
+            </w:r>
+          </w:p>
+        </w:tc>
+        <w:tc>
+          <w:tcPr/>
+          <w:p>
+            <w:pPr>
+              <w:pStyle w:val="Compact"/>
+              <w:jc w:val="left"/>
+            </w:pPr>
+            <w:r>
+              <w:t xml:space="preserve">Round A, answer 3</w:t>
             </w:r>
           </w:p>
         </w:tc>
@@ -671,31 +526,31 @@
               <w:jc w:val="left"/>
             </w:pPr>
             <w:r>
-              <w:t xml:space="preserve">OPEN</w:t>
-            </w:r>
-          </w:p>
-        </w:tc>
-        <w:tc>
-          <w:tcPr/>
-          <w:p>
-            <w:pPr>
-              <w:pStyle w:val="Compact"/>
-              <w:jc w:val="left"/>
-            </w:pPr>
-            <w:r>
-              <w:t xml:space="preserve">default: none; no model called</w:t>
-            </w:r>
-          </w:p>
-        </w:tc>
-        <w:tc>
-          <w:tcPr/>
-          <w:p>
-            <w:pPr>
-              <w:pStyle w:val="Compact"/>
-              <w:jc w:val="left"/>
-            </w:pPr>
-            <w:r>
-              <w:t xml:space="preserve">Security (UNRESOLVED)</w:t>
+              <w:t xml:space="preserve">DECIDED</w:t>
+            </w:r>
+          </w:p>
+        </w:tc>
+        <w:tc>
+          <w:tcPr/>
+          <w:p>
+            <w:pPr>
+              <w:pStyle w:val="Compact"/>
+              <w:jc w:val="left"/>
+            </w:pPr>
+            <w:r>
+              <w:t xml:space="preserve">No network egress from the application. Build and demo run offline.</w:t>
+            </w:r>
+          </w:p>
+        </w:tc>
+        <w:tc>
+          <w:tcPr/>
+          <w:p>
+            <w:pPr>
+              <w:pStyle w:val="Compact"/>
+              <w:jc w:val="left"/>
+            </w:pPr>
+            <w:r>
+              <w:t xml:space="preserve">Round A, answer 3</w:t>
             </w:r>
           </w:p>
         </w:tc>
@@ -733,31 +588,31 @@
               <w:jc w:val="left"/>
             </w:pPr>
             <w:r>
-              <w:t xml:space="preserve">OPEN</w:t>
-            </w:r>
-          </w:p>
-        </w:tc>
-        <w:tc>
-          <w:tcPr/>
-          <w:p>
-            <w:pPr>
-              <w:pStyle w:val="Compact"/>
-              <w:jc w:val="left"/>
-            </w:pPr>
-            <w:r>
-              <w:t xml:space="preserve">recorded as accepted-unresolved RA-01, unsigned</w:t>
-            </w:r>
-          </w:p>
-        </w:tc>
-        <w:tc>
-          <w:tcPr/>
-          <w:p>
-            <w:pPr>
-              <w:pStyle w:val="Compact"/>
-              <w:jc w:val="left"/>
-            </w:pPr>
-            <w:r>
-              <w:t xml:space="preserve">Compliance (UNRESOLVED)</w:t>
+              <w:t xml:space="preserve">DECIDED</w:t>
+            </w:r>
+          </w:p>
+        </w:tc>
+        <w:tc>
+          <w:tcPr/>
+          <w:p>
+            <w:pPr>
+              <w:pStyle w:val="Compact"/>
+              <w:jc w:val="left"/>
+            </w:pPr>
+            <w:r>
+              <w:t xml:space="preserve">No regime is named. The candidate obligations set stays an unvalidated working assumption.</w:t>
+            </w:r>
+          </w:p>
+        </w:tc>
+        <w:tc>
+          <w:tcPr/>
+          <w:p>
+            <w:pPr>
+              <w:pStyle w:val="Compact"/>
+              <w:jc w:val="left"/>
+            </w:pPr>
+            <w:r>
+              <w:t xml:space="preserve">Round B, answer 2</w:t>
             </w:r>
           </w:p>
         </w:tc>
@@ -795,31 +650,31 @@
               <w:jc w:val="left"/>
             </w:pPr>
             <w:r>
-              <w:t xml:space="preserve">OPEN</w:t>
-            </w:r>
-          </w:p>
-        </w:tc>
-        <w:tc>
-          <w:tcPr/>
-          <w:p>
-            <w:pPr>
-              <w:pStyle w:val="Compact"/>
-              <w:jc w:val="left"/>
-            </w:pPr>
-            <w:r>
-              <w:t xml:space="preserve">operator self-approves PROVISIONAL; G9 FAIL</w:t>
-            </w:r>
-          </w:p>
-        </w:tc>
-        <w:tc>
-          <w:tcPr/>
-          <w:p>
-            <w:pPr>
-              <w:pStyle w:val="Compact"/>
-              <w:jc w:val="left"/>
-            </w:pPr>
-            <w:r>
-              <w:t xml:space="preserve">Business sponsor (UNRESOLVED)</w:t>
+              <w:t xml:space="preserve">DECIDED</w:t>
+            </w:r>
+          </w:p>
+        </w:tc>
+        <w:tc>
+          <w:tcPr/>
+          <w:p>
+            <w:pPr>
+              <w:pStyle w:val="Compact"/>
+              <w:jc w:val="left"/>
+            </w:pPr>
+            <w:r>
+              <w:t xml:space="preserve">The operator (Dinesh) approves everything as Transformation Lead, under provisional authority. No other named party exists. A CTO review stays recommended.</w:t>
+            </w:r>
+          </w:p>
+        </w:tc>
+        <w:tc>
+          <w:tcPr/>
+          <w:p>
+            <w:pPr>
+              <w:pStyle w:val="Compact"/>
+              <w:jc w:val="left"/>
+            </w:pPr>
+            <w:r>
+              <w:t xml:space="preserve">Round A, answer 1</w:t>
             </w:r>
           </w:p>
         </w:tc>
@@ -857,31 +712,31 @@
               <w:jc w:val="left"/>
             </w:pPr>
             <w:r>
-              <w:t xml:space="preserve">RESOLVED (provisional)</w:t>
-            </w:r>
-          </w:p>
-        </w:tc>
-        <w:tc>
-          <w:tcPr/>
-          <w:p>
-            <w:pPr>
-              <w:pStyle w:val="Compact"/>
-              <w:jc w:val="left"/>
-            </w:pPr>
-            <w:r>
-              <w:t xml:space="preserve">thin read-only view built; Angular portal rejected</w:t>
-            </w:r>
-          </w:p>
-        </w:tc>
-        <w:tc>
-          <w:tcPr/>
-          <w:p>
-            <w:pPr>
-              <w:pStyle w:val="Compact"/>
-              <w:jc w:val="left"/>
-            </w:pPr>
-            <w:r>
-              <w:t xml:space="preserve">Product (UNRESOLVED)</w:t>
+              <w:t xml:space="preserve">RATIFIED</w:t>
+            </w:r>
+          </w:p>
+        </w:tc>
+        <w:tc>
+          <w:tcPr/>
+          <w:p>
+            <w:pPr>
+              <w:pStyle w:val="Compact"/>
+              <w:jc w:val="left"/>
+            </w:pPr>
+            <w:r>
+              <w:t xml:space="preserve">A thin read-only operations view, not an Angular portal. Previously RESOLVED (provisional).</w:t>
+            </w:r>
+          </w:p>
+        </w:tc>
+        <w:tc>
+          <w:tcPr/>
+          <w:p>
+            <w:pPr>
+              <w:pStyle w:val="Compact"/>
+              <w:jc w:val="left"/>
+            </w:pPr>
+            <w:r>
+              <w:t xml:space="preserve">Round D</w:t>
             </w:r>
           </w:p>
         </w:tc>
@@ -919,31 +774,31 @@
               <w:jc w:val="left"/>
             </w:pPr>
             <w:r>
-              <w:t xml:space="preserve">OPEN</w:t>
-            </w:r>
-          </w:p>
-        </w:tc>
-        <w:tc>
-          <w:tcPr/>
-          <w:p>
-            <w:pPr>
-              <w:pStyle w:val="Compact"/>
-              <w:jc w:val="left"/>
-            </w:pPr>
-            <w:r>
-              <w:t xml:space="preserve">HS256 interim (ADR-0004); JWKS stub</w:t>
-            </w:r>
-          </w:p>
-        </w:tc>
-        <w:tc>
-          <w:tcPr/>
-          <w:p>
-            <w:pPr>
-              <w:pStyle w:val="Compact"/>
-              <w:jc w:val="left"/>
-            </w:pPr>
-            <w:r>
-              <w:t xml:space="preserve">Security (UNRESOLVED)</w:t>
+              <w:t xml:space="preserve">DEFERRED</w:t>
+            </w:r>
+          </w:p>
+        </w:tc>
+        <w:tc>
+          <w:tcPr/>
+          <w:p>
+            <w:pPr>
+              <w:pStyle w:val="Compact"/>
+              <w:jc w:val="left"/>
+            </w:pPr>
+            <w:r>
+              <w:t xml:space="preserve">No provider chosen. HS256 stays an interim scheme, not for production; JWKS stays a fail-closed stub.</w:t>
+            </w:r>
+          </w:p>
+        </w:tc>
+        <w:tc>
+          <w:tcPr/>
+          <w:p>
+            <w:pPr>
+              <w:pStyle w:val="Compact"/>
+              <w:jc w:val="left"/>
+            </w:pPr>
+            <w:r>
+              <w:t xml:space="preserve">Round C, answer 1</w:t>
             </w:r>
           </w:p>
         </w:tc>
@@ -981,31 +836,31 @@
               <w:jc w:val="left"/>
             </w:pPr>
             <w:r>
-              <w:t xml:space="preserve">ASSUMED</w:t>
-            </w:r>
-          </w:p>
-        </w:tc>
-        <w:tc>
-          <w:tcPr/>
-          <w:p>
-            <w:pPr>
-              <w:pStyle w:val="Compact"/>
-              <w:jc w:val="left"/>
-            </w:pPr>
-            <w:r>
-              <w:t xml:space="preserve">used as proxies throughout; sponsor never confirmed</w:t>
-            </w:r>
-          </w:p>
-        </w:tc>
-        <w:tc>
-          <w:tcPr/>
-          <w:p>
-            <w:pPr>
-              <w:pStyle w:val="Compact"/>
-              <w:jc w:val="left"/>
-            </w:pPr>
-            <w:r>
-              <w:t xml:space="preserve">Business sponsor (UNRESOLVED)</w:t>
+              <w:t xml:space="preserve">RATIFIED</w:t>
+            </w:r>
+          </w:p>
+        </w:tc>
+        <w:tc>
+          <w:tcPr/>
+          <w:p>
+            <w:pPr>
+              <w:pStyle w:val="Compact"/>
+              <w:jc w:val="left"/>
+            </w:pPr>
+            <w:r>
+              <w:t xml:space="preserve">The labelled proxy KPIs are accepted as the frozen baseline. No real business data exists.</w:t>
+            </w:r>
+          </w:p>
+        </w:tc>
+        <w:tc>
+          <w:tcPr/>
+          <w:p>
+            <w:pPr>
+              <w:pStyle w:val="Compact"/>
+              <w:jc w:val="left"/>
+            </w:pPr>
+            <w:r>
+              <w:t xml:space="preserve">Round B, answer 4</w:t>
             </w:r>
           </w:p>
         </w:tc>
@@ -1043,31 +898,31 @@
               <w:jc w:val="left"/>
             </w:pPr>
             <w:r>
-              <w:t xml:space="preserve">OPEN</w:t>
-            </w:r>
-          </w:p>
-        </w:tc>
-        <w:tc>
-          <w:tcPr/>
-          <w:p>
-            <w:pPr>
-              <w:pStyle w:val="Compact"/>
-              <w:jc w:val="left"/>
-            </w:pPr>
-            <w:r>
-              <w:t xml:space="preserve">ROI/NPV parameterised in analyst-hours; no money</w:t>
-            </w:r>
-          </w:p>
-        </w:tc>
-        <w:tc>
-          <w:tcPr/>
-          <w:p>
-            <w:pPr>
-              <w:pStyle w:val="Compact"/>
-              <w:jc w:val="left"/>
-            </w:pPr>
-            <w:r>
-              <w:t xml:space="preserve">Business sponsor (UNRESOLVED)</w:t>
+              <w:t xml:space="preserve">DECIDED</w:t>
+            </w:r>
+          </w:p>
+        </w:tc>
+        <w:tc>
+          <w:tcPr/>
+          <w:p>
+            <w:pPr>
+              <w:pStyle w:val="Compact"/>
+              <w:jc w:val="left"/>
+            </w:pPr>
+            <w:r>
+              <w:t xml:space="preserve">No financial data. The benefit model stays in analyst-hours with sensitivity ranges and no money figure.</w:t>
+            </w:r>
+          </w:p>
+        </w:tc>
+        <w:tc>
+          <w:tcPr/>
+          <w:p>
+            <w:pPr>
+              <w:pStyle w:val="Compact"/>
+              <w:jc w:val="left"/>
+            </w:pPr>
+            <w:r>
+              <w:t xml:space="preserve">Round B, answer 4</w:t>
             </w:r>
           </w:p>
         </w:tc>
@@ -1105,31 +960,31 @@
               <w:jc w:val="left"/>
             </w:pPr>
             <w:r>
-              <w:t xml:space="preserve">OPEN</w:t>
-            </w:r>
-          </w:p>
-        </w:tc>
-        <w:tc>
-          <w:tcPr/>
-          <w:p>
-            <w:pPr>
-              <w:pStyle w:val="Compact"/>
-              <w:jc w:val="left"/>
-            </w:pPr>
-            <w:r>
-              <w:t xml:space="preserve">in-repo, hash-manifested</w:t>
-            </w:r>
-          </w:p>
-        </w:tc>
-        <w:tc>
-          <w:tcPr/>
-          <w:p>
-            <w:pPr>
-              <w:pStyle w:val="Compact"/>
-              <w:jc w:val="left"/>
-            </w:pPr>
-            <w:r>
-              <w:t xml:space="preserve">Compliance (UNRESOLVED)</w:t>
+              <w:t xml:space="preserve">RATIFIED</w:t>
+            </w:r>
+          </w:p>
+        </w:tc>
+        <w:tc>
+          <w:tcPr/>
+          <w:p>
+            <w:pPr>
+              <w:pStyle w:val="Compact"/>
+              <w:jc w:val="left"/>
+            </w:pPr>
+            <w:r>
+              <w:t xml:space="preserve">Evidence stays in the repository, hash-manifested and version-controlled.</w:t>
+            </w:r>
+          </w:p>
+        </w:tc>
+        <w:tc>
+          <w:tcPr/>
+          <w:p>
+            <w:pPr>
+              <w:pStyle w:val="Compact"/>
+              <w:jc w:val="left"/>
+            </w:pPr>
+            <w:r>
+              <w:t xml:space="preserve">Round D</w:t>
             </w:r>
           </w:p>
         </w:tc>
@@ -1167,31 +1022,31 @@
               <w:jc w:val="left"/>
             </w:pPr>
             <w:r>
-              <w:t xml:space="preserve">CONDITIONAL</w:t>
-            </w:r>
-          </w:p>
-        </w:tc>
-        <w:tc>
-          <w:tcPr/>
-          <w:p>
-            <w:pPr>
-              <w:pStyle w:val="Compact"/>
-              <w:jc w:val="left"/>
-            </w:pPr>
-            <w:r>
-              <w:t xml:space="preserve">operator instruction D-009; CTO ratification pending; EVD-G-04 unsigned</w:t>
-            </w:r>
-          </w:p>
-        </w:tc>
-        <w:tc>
-          <w:tcPr/>
-          <w:p>
-            <w:pPr>
-              <w:pStyle w:val="Compact"/>
-              <w:jc w:val="left"/>
-            </w:pPr>
-            <w:r>
-              <w:t xml:space="preserve">CTO (not named)</w:t>
+              <w:t xml:space="preserve">RATIFIED</w:t>
+            </w:r>
+          </w:p>
+        </w:tc>
+        <w:tc>
+          <w:tcPr/>
+          <w:p>
+            <w:pPr>
+              <w:pStyle w:val="Compact"/>
+              <w:jc w:val="left"/>
+            </w:pPr>
+            <w:r>
+              <w:t xml:space="preserve">The operator ratifies, in their own name, the write authorisation given as instruction D-009. A CTO ratification stays recommended.</w:t>
+            </w:r>
+          </w:p>
+        </w:tc>
+        <w:tc>
+          <w:tcPr/>
+          <w:p>
+            <w:pPr>
+              <w:pStyle w:val="Compact"/>
+              <w:jc w:val="left"/>
+            </w:pPr>
+            <w:r>
+              <w:t xml:space="preserve">Round A, answer 1</w:t>
             </w:r>
           </w:p>
         </w:tc>
@@ -1229,31 +1084,31 @@
               <w:jc w:val="left"/>
             </w:pPr>
             <w:r>
-              <w:t xml:space="preserve">ASSUMED</w:t>
-            </w:r>
-          </w:p>
-        </w:tc>
-        <w:tc>
-          <w:tcPr/>
-          <w:p>
-            <w:pPr>
-              <w:pStyle w:val="Compact"/>
-              <w:jc w:val="left"/>
-            </w:pPr>
-            <w:r>
-              <w:t xml:space="preserve">none stated; demo 10 min proposed</w:t>
-            </w:r>
-          </w:p>
-        </w:tc>
-        <w:tc>
-          <w:tcPr/>
-          <w:p>
-            <w:pPr>
-              <w:pStyle w:val="Compact"/>
-              <w:jc w:val="left"/>
-            </w:pPr>
-            <w:r>
-              <w:t xml:space="preserve">Transformation lead</w:t>
+              <w:t xml:space="preserve">DECIDED</w:t>
+            </w:r>
+          </w:p>
+        </w:tc>
+        <w:tc>
+          <w:tcPr/>
+          <w:p>
+            <w:pPr>
+              <w:pStyle w:val="Compact"/>
+              <w:jc w:val="left"/>
+            </w:pPr>
+            <w:r>
+              <w:t xml:space="preserve">Demo budget is 10 minutes plus 5 minutes of questions. No engagement deadline was stated.</w:t>
+            </w:r>
+          </w:p>
+        </w:tc>
+        <w:tc>
+          <w:tcPr/>
+          <w:p>
+            <w:pPr>
+              <w:pStyle w:val="Compact"/>
+              <w:jc w:val="left"/>
+            </w:pPr>
+            <w:r>
+              <w:t xml:space="preserve">Round A, answer 4</w:t>
             </w:r>
           </w:p>
         </w:tc>
@@ -1291,31 +1146,46 @@
               <w:jc w:val="left"/>
             </w:pPr>
             <w:r>
-              <w:t xml:space="preserve">RESOLVED</w:t>
-            </w:r>
-          </w:p>
-        </w:tc>
-        <w:tc>
-          <w:tcPr/>
-          <w:p>
-            <w:pPr>
-              <w:pStyle w:val="Compact"/>
-              <w:jc w:val="left"/>
-            </w:pPr>
-            <w:r>
-              <w:t xml:space="preserve">D-001</w:t>
-            </w:r>
-          </w:p>
-        </w:tc>
-        <w:tc>
-          <w:tcPr/>
-          <w:p>
-            <w:pPr>
-              <w:pStyle w:val="Compact"/>
-              <w:jc w:val="left"/>
-            </w:pPr>
-            <w:r>
-              <w:t xml:space="preserve">Transformation lead</w:t>
+              <w:t xml:space="preserve">RATIFIED</w:t>
+            </w:r>
+          </w:p>
+        </w:tc>
+        <w:tc>
+          <w:tcPr/>
+          <w:p>
+            <w:pPr>
+              <w:pStyle w:val="Compact"/>
+              <w:jc w:val="left"/>
+            </w:pPr>
+            <w:r>
+              <w:t xml:space="preserve">The spine path</w:t>
+            </w:r>
+            <w:r>
+              <w:t xml:space="preserve"> </w:t>
+            </w:r>
+            <w:r>
+              <w:rPr>
+                <w:rStyle w:val="VerbatimChar"/>
+              </w:rPr>
+              <w:t xml:space="preserve">docs/00-preflight/discovery/</w:t>
+            </w:r>
+            <w:r>
+              <w:t xml:space="preserve"> </w:t>
+            </w:r>
+            <w:r>
+              <w:t xml:space="preserve">is authoritative.</w:t>
+            </w:r>
+          </w:p>
+        </w:tc>
+        <w:tc>
+          <w:tcPr/>
+          <w:p>
+            <w:pPr>
+              <w:pStyle w:val="Compact"/>
+              <w:jc w:val="left"/>
+            </w:pPr>
+            <w:r>
+              <w:t xml:space="preserve">Round D</w:t>
             </w:r>
           </w:p>
         </w:tc>
@@ -1353,31 +1223,46 @@
               <w:jc w:val="left"/>
             </w:pPr>
             <w:r>
-              <w:t xml:space="preserve">RESOLVED (provisional)</w:t>
-            </w:r>
-          </w:p>
-        </w:tc>
-        <w:tc>
-          <w:tcPr/>
-          <w:p>
-            <w:pPr>
-              <w:pStyle w:val="Compact"/>
-              <w:jc w:val="left"/>
-            </w:pPr>
-            <w:r>
-              <w:t xml:space="preserve">derived curated layer; fixture immutable</w:t>
-            </w:r>
-          </w:p>
-        </w:tc>
-        <w:tc>
-          <w:tcPr/>
-          <w:p>
-            <w:pPr>
-              <w:pStyle w:val="Compact"/>
-              <w:jc w:val="left"/>
-            </w:pPr>
-            <w:r>
-              <w:t xml:space="preserve">Data owner (UNRESOLVED)</w:t>
+              <w:t xml:space="preserve">RATIFIED</w:t>
+            </w:r>
+          </w:p>
+        </w:tc>
+        <w:tc>
+          <w:tcPr/>
+          <w:p>
+            <w:pPr>
+              <w:pStyle w:val="Compact"/>
+              <w:jc w:val="left"/>
+            </w:pPr>
+            <w:r>
+              <w:t xml:space="preserve">A derived curated layer; the fixture in</w:t>
+            </w:r>
+            <w:r>
+              <w:t xml:space="preserve"> </w:t>
+            </w:r>
+            <w:r>
+              <w:rPr>
+                <w:rStyle w:val="VerbatimChar"/>
+              </w:rPr>
+              <w:t xml:space="preserve">data/synthetic/</w:t>
+            </w:r>
+            <w:r>
+              <w:t xml:space="preserve"> </w:t>
+            </w:r>
+            <w:r>
+              <w:t xml:space="preserve">stays immutable.</w:t>
+            </w:r>
+          </w:p>
+        </w:tc>
+        <w:tc>
+          <w:tcPr/>
+          <w:p>
+            <w:pPr>
+              <w:pStyle w:val="Compact"/>
+              <w:jc w:val="left"/>
+            </w:pPr>
+            <w:r>
+              <w:t xml:space="preserve">Round D</w:t>
             </w:r>
           </w:p>
         </w:tc>
@@ -1415,31 +1300,31 @@
               <w:jc w:val="left"/>
             </w:pPr>
             <w:r>
-              <w:t xml:space="preserve">OPEN</w:t>
-            </w:r>
-          </w:p>
-        </w:tc>
-        <w:tc>
-          <w:tcPr/>
-          <w:p>
-            <w:pPr>
-              <w:pStyle w:val="Compact"/>
-              <w:jc w:val="left"/>
-            </w:pPr>
-            <w:r>
-              <w:t xml:space="preserve">treated as an invalid key; owner intent unconfirmed</w:t>
-            </w:r>
-          </w:p>
-        </w:tc>
-        <w:tc>
-          <w:tcPr/>
-          <w:p>
-            <w:pPr>
-              <w:pStyle w:val="Compact"/>
-              <w:jc w:val="left"/>
-            </w:pPr>
-            <w:r>
-              <w:t xml:space="preserve">Data owner (UNRESOLVED)</w:t>
+              <w:t xml:space="preserve">DECIDED</w:t>
+            </w:r>
+          </w:p>
+        </w:tc>
+        <w:tc>
+          <w:tcPr/>
+          <w:p>
+            <w:pPr>
+              <w:pStyle w:val="Compact"/>
+              <w:jc w:val="left"/>
+            </w:pPr>
+            <w:r>
+              <w:t xml:space="preserve">Handling decided: treat as a defect (lookup logic fixed, bad-key rows quarantined). The data owner’s intent is UNKNOWN.</w:t>
+            </w:r>
+          </w:p>
+        </w:tc>
+        <w:tc>
+          <w:tcPr/>
+          <w:p>
+            <w:pPr>
+              <w:pStyle w:val="Compact"/>
+              <w:jc w:val="left"/>
+            </w:pPr>
+            <w:r>
+              <w:t xml:space="preserve">Round C, answer 2</w:t>
             </w:r>
           </w:p>
         </w:tc>
@@ -1477,31 +1362,31 @@
               <w:jc w:val="left"/>
             </w:pPr>
             <w:r>
-              <w:t xml:space="preserve">PROPOSED</w:t>
-            </w:r>
-          </w:p>
-        </w:tc>
-        <w:tc>
-          <w:tcPr/>
-          <w:p>
-            <w:pPr>
-              <w:pStyle w:val="Compact"/>
-              <w:jc w:val="left"/>
-            </w:pPr>
-            <w:r>
-              <w:t xml:space="preserve">local, offline, deterministic provider</w:t>
-            </w:r>
-          </w:p>
-        </w:tc>
-        <w:tc>
-          <w:tcPr/>
-          <w:p>
-            <w:pPr>
-              <w:pStyle w:val="Compact"/>
-              <w:jc w:val="left"/>
-            </w:pPr>
-            <w:r>
-              <w:t xml:space="preserve">SRE (UNRESOLVED)</w:t>
+              <w:t xml:space="preserve">DECIDED</w:t>
+            </w:r>
+          </w:p>
+        </w:tc>
+        <w:tc>
+          <w:tcPr/>
+          <w:p>
+            <w:pPr>
+              <w:pStyle w:val="Compact"/>
+              <w:jc w:val="left"/>
+            </w:pPr>
+            <w:r>
+              <w:t xml:space="preserve">Local, offline, deterministic provider.</w:t>
+            </w:r>
+          </w:p>
+        </w:tc>
+        <w:tc>
+          <w:tcPr/>
+          <w:p>
+            <w:pPr>
+              <w:pStyle w:val="Compact"/>
+              <w:jc w:val="left"/>
+            </w:pPr>
+            <w:r>
+              <w:t xml:space="preserve">Round A, answer 4</w:t>
             </w:r>
           </w:p>
         </w:tc>
@@ -1539,31 +1424,31 @@
               <w:jc w:val="left"/>
             </w:pPr>
             <w:r>
-              <w:t xml:space="preserve">PROPOSED</w:t>
-            </w:r>
-          </w:p>
-        </w:tc>
-        <w:tc>
-          <w:tcPr/>
-          <w:p>
-            <w:pPr>
-              <w:pStyle w:val="Compact"/>
-              <w:jc w:val="left"/>
-            </w:pPr>
-            <w:r>
-              <w:t xml:space="preserve">10 minutes + 5 questions</w:t>
-            </w:r>
-          </w:p>
-        </w:tc>
-        <w:tc>
-          <w:tcPr/>
-          <w:p>
-            <w:pPr>
-              <w:pStyle w:val="Compact"/>
-              <w:jc w:val="left"/>
-            </w:pPr>
-            <w:r>
-              <w:t xml:space="preserve">Transformation lead</w:t>
+              <w:t xml:space="preserve">DECIDED</w:t>
+            </w:r>
+          </w:p>
+        </w:tc>
+        <w:tc>
+          <w:tcPr/>
+          <w:p>
+            <w:pPr>
+              <w:pStyle w:val="Compact"/>
+              <w:jc w:val="left"/>
+            </w:pPr>
+            <w:r>
+              <w:t xml:space="preserve">10 minutes plus 5 of questions, live and offline. This differs from the register default of 20 plus 10, and the difference is now a recorded decision.</w:t>
+            </w:r>
+          </w:p>
+        </w:tc>
+        <w:tc>
+          <w:tcPr/>
+          <w:p>
+            <w:pPr>
+              <w:pStyle w:val="Compact"/>
+              <w:jc w:val="left"/>
+            </w:pPr>
+            <w:r>
+              <w:t xml:space="preserve">Round A, answer 4</w:t>
             </w:r>
           </w:p>
         </w:tc>
@@ -1601,31 +1486,31 @@
               <w:jc w:val="left"/>
             </w:pPr>
             <w:r>
-              <w:t xml:space="preserve">OPEN</w:t>
-            </w:r>
-          </w:p>
-        </w:tc>
-        <w:tc>
-          <w:tcPr/>
-          <w:p>
-            <w:pPr>
-              <w:pStyle w:val="Compact"/>
-              <w:jc w:val="left"/>
-            </w:pPr>
-            <w:r>
-              <w:t xml:space="preserve">J6 recorded not applicable</w:t>
-            </w:r>
-          </w:p>
-        </w:tc>
-        <w:tc>
-          <w:tcPr/>
-          <w:p>
-            <w:pPr>
-              <w:pStyle w:val="Compact"/>
-              <w:jc w:val="left"/>
-            </w:pPr>
-            <w:r>
-              <w:t xml:space="preserve">AI governance (UNRESOLVED)</w:t>
+              <w:t xml:space="preserve">DECIDED</w:t>
+            </w:r>
+          </w:p>
+        </w:tc>
+        <w:tc>
+          <w:tcPr/>
+          <w:p>
+            <w:pPr>
+              <w:pStyle w:val="Compact"/>
+              <w:jc w:val="left"/>
+            </w:pPr>
+            <w:r>
+              <w:t xml:space="preserve">Not in scope. J6 stands as not-applicable.</w:t>
+            </w:r>
+          </w:p>
+        </w:tc>
+        <w:tc>
+          <w:tcPr/>
+          <w:p>
+            <w:pPr>
+              <w:pStyle w:val="Compact"/>
+              <w:jc w:val="left"/>
+            </w:pPr>
+            <w:r>
+              <w:t xml:space="preserve">Round C, answer 3</w:t>
             </w:r>
           </w:p>
         </w:tc>
@@ -1663,44 +1548,31 @@
               <w:jc w:val="left"/>
             </w:pPr>
             <w:r>
-              <w:t xml:space="preserve">OPEN</w:t>
-            </w:r>
-          </w:p>
-        </w:tc>
-        <w:tc>
-          <w:tcPr/>
-          <w:p>
-            <w:pPr>
-              <w:pStyle w:val="Compact"/>
-              <w:jc w:val="left"/>
-            </w:pPr>
-            <w:r>
-              <w:t xml:space="preserve">history not rewritten; rotation planned;</w:t>
-            </w:r>
-            <w:r>
-              <w:t xml:space="preserve"> </w:t>
-            </w:r>
-            <w:r>
-              <w:rPr>
-                <w:bCs/>
-                <w:b/>
-              </w:rPr>
-              <w:t xml:space="preserve">nothing revoked</w:t>
-            </w:r>
-            <w:r>
-              <w:t xml:space="preserve">; repo public</w:t>
-            </w:r>
-          </w:p>
-        </w:tc>
-        <w:tc>
-          <w:tcPr/>
-          <w:p>
-            <w:pPr>
-              <w:pStyle w:val="Compact"/>
-              <w:jc w:val="left"/>
-            </w:pPr>
-            <w:r>
-              <w:t xml:space="preserve">Security (UNRESOLVED)</w:t>
+              <w:t xml:space="preserve">DECIDED</w:t>
+            </w:r>
+          </w:p>
+        </w:tc>
+        <w:tc>
+          <w:tcPr/>
+          <w:p>
+            <w:pPr>
+              <w:pStyle w:val="Compact"/>
+              <w:jc w:val="left"/>
+            </w:pPr>
+            <w:r>
+              <w:t xml:space="preserve">Keep history unrewritten; treat the values as compromised; the repository is private. Nothing real exists to revoke: they are workshop placeholders, and none may be reused anywhere.</w:t>
+            </w:r>
+          </w:p>
+        </w:tc>
+        <w:tc>
+          <w:tcPr/>
+          <w:p>
+            <w:pPr>
+              <w:pStyle w:val="Compact"/>
+              <w:jc w:val="left"/>
+            </w:pPr>
+            <w:r>
+              <w:t xml:space="preserve">Round B, answer 1; repository set private by the operator</w:t>
             </w:r>
           </w:p>
         </w:tc>
@@ -1738,31 +1610,31 @@
               <w:jc w:val="left"/>
             </w:pPr>
             <w:r>
-              <w:t xml:space="preserve">RESOLVED (provisional)</w:t>
-            </w:r>
-          </w:p>
-        </w:tc>
-        <w:tc>
-          <w:tcPr/>
-          <w:p>
-            <w:pPr>
-              <w:pStyle w:val="Compact"/>
-              <w:jc w:val="left"/>
-            </w:pPr>
-            <w:r>
-              <w:t xml:space="preserve">readiness only; no deployment</w:t>
-            </w:r>
-          </w:p>
-        </w:tc>
-        <w:tc>
-          <w:tcPr/>
-          <w:p>
-            <w:pPr>
-              <w:pStyle w:val="Compact"/>
-              <w:jc w:val="left"/>
-            </w:pPr>
-            <w:r>
-              <w:t xml:space="preserve">CTO (not named)</w:t>
+              <w:t xml:space="preserve">DECIDED</w:t>
+            </w:r>
+          </w:p>
+        </w:tc>
+        <w:tc>
+          <w:tcPr/>
+          <w:p>
+            <w:pPr>
+              <w:pStyle w:val="Compact"/>
+              <w:jc w:val="left"/>
+            </w:pPr>
+            <w:r>
+              <w:t xml:space="preserve">Readiness decision only. Nothing is deployed.</w:t>
+            </w:r>
+          </w:p>
+        </w:tc>
+        <w:tc>
+          <w:tcPr/>
+          <w:p>
+            <w:pPr>
+              <w:pStyle w:val="Compact"/>
+              <w:jc w:val="left"/>
+            </w:pPr>
+            <w:r>
+              <w:t xml:space="preserve">Round B, answer 3</w:t>
             </w:r>
           </w:p>
         </w:tc>
@@ -1800,31 +1672,31 @@
               <w:jc w:val="left"/>
             </w:pPr>
             <w:r>
-              <w:t xml:space="preserve">OPEN</w:t>
-            </w:r>
-          </w:p>
-        </w:tc>
-        <w:tc>
-          <w:tcPr/>
-          <w:p>
-            <w:pPr>
-              <w:pStyle w:val="Compact"/>
-              <w:jc w:val="left"/>
-            </w:pPr>
-            <w:r>
-              <w:t xml:space="preserve">masking applied; retention/rights undefined (RA-10)</w:t>
-            </w:r>
-          </w:p>
-        </w:tc>
-        <w:tc>
-          <w:tcPr/>
-          <w:p>
-            <w:pPr>
-              <w:pStyle w:val="Compact"/>
-              <w:jc w:val="left"/>
-            </w:pPr>
-            <w:r>
-              <w:t xml:space="preserve">Compliance (UNRESOLVED)</w:t>
+              <w:t xml:space="preserve">DECIDED</w:t>
+            </w:r>
+          </w:p>
+        </w:tc>
+        <w:tc>
+          <w:tcPr/>
+          <w:p>
+            <w:pPr>
+              <w:pStyle w:val="Compact"/>
+              <w:jc w:val="left"/>
+            </w:pPr>
+            <w:r>
+              <w:t xml:space="preserve">No limits stated. The minimisation default stays: location fields masked and excluded from prompts and from logs above INFO.</w:t>
+            </w:r>
+          </w:p>
+        </w:tc>
+        <w:tc>
+          <w:tcPr/>
+          <w:p>
+            <w:pPr>
+              <w:pStyle w:val="Compact"/>
+              <w:jc w:val="left"/>
+            </w:pPr>
+            <w:r>
+              <w:t xml:space="preserve">Round B, answer 2</w:t>
             </w:r>
           </w:p>
         </w:tc>
@@ -1862,31 +1734,31 @@
               <w:jc w:val="left"/>
             </w:pPr>
             <w:r>
-              <w:t xml:space="preserve">RESOLVED</w:t>
-            </w:r>
-          </w:p>
-        </w:tc>
-        <w:tc>
-          <w:tcPr/>
-          <w:p>
-            <w:pPr>
-              <w:pStyle w:val="Compact"/>
-              <w:jc w:val="left"/>
-            </w:pPr>
-            <w:r>
-              <w:t xml:space="preserve">original sanity_check assertions retained (H-X10)</w:t>
-            </w:r>
-          </w:p>
-        </w:tc>
-        <w:tc>
-          <w:tcPr/>
-          <w:p>
-            <w:pPr>
-              <w:pStyle w:val="Compact"/>
-              <w:jc w:val="left"/>
-            </w:pPr>
-            <w:r>
-              <w:t xml:space="preserve">Transformation lead</w:t>
+              <w:t xml:space="preserve">RATIFIED</w:t>
+            </w:r>
+          </w:p>
+        </w:tc>
+        <w:tc>
+          <w:tcPr/>
+          <w:p>
+            <w:pPr>
+              <w:pStyle w:val="Compact"/>
+              <w:jc w:val="left"/>
+            </w:pPr>
+            <w:r>
+              <w:t xml:space="preserve">The original sanity_check assertions stay unchanged.</w:t>
+            </w:r>
+          </w:p>
+        </w:tc>
+        <w:tc>
+          <w:tcPr/>
+          <w:p>
+            <w:pPr>
+              <w:pStyle w:val="Compact"/>
+              <w:jc w:val="left"/>
+            </w:pPr>
+            <w:r>
+              <w:t xml:space="preserve">Round D</w:t>
             </w:r>
           </w:p>
         </w:tc>
@@ -1924,31 +1796,31 @@
               <w:jc w:val="left"/>
             </w:pPr>
             <w:r>
-              <w:t xml:space="preserve">OPEN</w:t>
-            </w:r>
-          </w:p>
-        </w:tc>
-        <w:tc>
-          <w:tcPr/>
-          <w:p>
-            <w:pPr>
-              <w:pStyle w:val="Compact"/>
-              <w:jc w:val="left"/>
-            </w:pPr>
-            <w:r>
-              <w:t xml:space="preserve">one operator and one agent</w:t>
-            </w:r>
-          </w:p>
-        </w:tc>
-        <w:tc>
-          <w:tcPr/>
-          <w:p>
-            <w:pPr>
-              <w:pStyle w:val="Compact"/>
-              <w:jc w:val="left"/>
-            </w:pPr>
-            <w:r>
-              <w:t xml:space="preserve">Transformation lead</w:t>
+              <w:t xml:space="preserve">DECIDED</w:t>
+            </w:r>
+          </w:p>
+        </w:tc>
+        <w:tc>
+          <w:tcPr/>
+          <w:p>
+            <w:pPr>
+              <w:pStyle w:val="Compact"/>
+              <w:jc w:val="left"/>
+            </w:pPr>
+            <w:r>
+              <w:t xml:space="preserve">One operator plus the agent; sequential execution.</w:t>
+            </w:r>
+          </w:p>
+        </w:tc>
+        <w:tc>
+          <w:tcPr/>
+          <w:p>
+            <w:pPr>
+              <w:pStyle w:val="Compact"/>
+              <w:jc w:val="left"/>
+            </w:pPr>
+            <w:r>
+              <w:t xml:space="preserve">Round C, answer 4</w:t>
             </w:r>
           </w:p>
         </w:tc>
@@ -1959,17 +1831,31 @@
         <w:pStyle w:val="BodyText"/>
       </w:pPr>
       <w:r>
-        <w:t xml:space="preserve">Counts: 2 resolved, 3 resolved provisionally, 5 assumed/proposed/conditional, 13 open (total 23).</w:t>
+        <w:t xml:space="preserve">Meaning of each decision, what changes if it is reversed, and the residual gap:</w:t>
       </w:r>
       <w:r>
         <w:t xml:space="preserve"> </w:t>
       </w:r>
       <w:r>
         <w:rPr>
-          <w:bCs/>
-          <w:b/>
+          <w:rStyle w:val="VerbatimChar"/>
         </w:rPr>
-        <w:t xml:space="preserve">R-X9 is NOT MET.</w:t>
+        <w:t xml:space="preserve">docs/44-decisions/open-questions-register-v2.md</w:t>
+      </w:r>
+      <w:r>
+        <w:t xml:space="preserve">. What an independent signer can add:</w:t>
+      </w:r>
+      <w:r>
+        <w:t xml:space="preserve"> </w:t>
+      </w:r>
+      <w:r>
+        <w:rPr>
+          <w:rStyle w:val="VerbatimChar"/>
+        </w:rPr>
+        <w:t xml:space="preserve">docs/44-decisions/cto-signoff-pack.md</w:t>
+      </w:r>
+      <w:r>
+        <w:t xml:space="preserve">.</w:t>
       </w:r>
     </w:p>
     <w:bookmarkEnd w:id="20"/>

</xml_diff>